<commit_message>
Co dinh duong dan API tra cuu tien MCCT, bo key cau hinh
Bo key HIS.CHECK_HEIN_CARD.BHXH__API_MCCT. Duong dan
api/TraCuuCCT/TraCuuTienMCCT do cong BHXH quy dinh, khong thay doi
theo tung benh vien nen co dinh bang hang so trong
ApiInsuranceExpertise.

- BHXHLoginCFG: bo API_MCCT va CONFIG_KEY_BHXH__API_MCCT.
  Chi con AUTO_CHECK_MCCT (bat/tat tra cuu tu dong).
- HeinGOVManager: bo gan ApiMcct truoc khi goi API.
- Cap nhat tai lieu thiet ke va tai lieu module.

Con dung mot cau hinh duy nhat cho tinh nang nay:
HIS.CHECK_HEIN_CARD.BHXH__AUTO_CHECK_MCCT

Co-Authored-By: Claude Opus 5 (1M context) <noreply@anthropic.com>
</commit_message>
<xml_diff>
--- a/docs/B_KyThuat_TraCuuTienMCCT_CungChiTraLuyKe.docx
+++ b/docs/B_KyThuat_TraCuuTienMCCT_CungChiTraLuyKe.docx
@@ -9882,18 +9882,6 @@
                 <w:rFonts w:ascii="Consolas" w:hAnsi="Consolas" w:eastAsia="Consolas"/>
                 <w:sz w:val="18"/>
               </w:rPr>
-              <w:t>HIS.CHECK_HEIN_CARD.BHXH__API_MCCT           (mặc định: api/TraCuuCCT/TraCuuTienMCCT)</w:t>
-            </w:r>
-          </w:p>
-          <w:p>
-            <w:pPr>
-              <w:spacing w:before="0" w:after="0" w:line="240" w:lineRule="auto"/>
-            </w:pPr>
-            <w:r>
-              <w:rPr>
-                <w:rFonts w:ascii="Consolas" w:hAnsi="Consolas" w:eastAsia="Consolas"/>
-                <w:sz w:val="18"/>
-              </w:rPr>
               <w:t>HIS.CHECK_HEIN_CARD.BHXH__AUTO_CHECK_MCCT    (0 = tắt tự động, 1 = bật)</w:t>
             </w:r>
           </w:p>
@@ -9901,6 +9889,72 @@
       </w:tr>
     </w:tbl>
     <w:p/>
+    <w:p>
+      <w:pPr>
+        <w:spacing w:after="120"/>
+        <w:jc w:val="both"/>
+      </w:pPr>
+      <w:r>
+        <w:rPr>
+          <w:b/>
+        </w:rPr>
+        <w:t>Đường dẫn API cố định trong code</w:t>
+      </w:r>
+      <w:r>
+        <w:t>, không đưa ra cấu hình:</w:t>
+      </w:r>
+    </w:p>
+    <w:tbl>
+      <w:tblPr>
+        <w:tblW w:type="auto" w:w="0"/>
+        <w:jc w:val="left"/>
+        <w:tblLook w:firstColumn="1" w:firstRow="1" w:lastColumn="0" w:lastRow="0" w:noHBand="0" w:noVBand="1" w:val="04A0"/>
+      </w:tblPr>
+      <w:tblGrid>
+        <w:gridCol w:w="9973"/>
+      </w:tblGrid>
+      <w:tr>
+        <w:tc>
+          <w:tcPr>
+            <w:tcW w:type="dxa" w:w="9973"/>
+            <w:shd w:val="clear" w:fill="F4F5F7"/>
+          </w:tcPr>
+          <w:p>
+            <w:pPr>
+              <w:spacing w:before="0" w:after="0" w:line="240" w:lineRule="auto"/>
+            </w:pPr>
+            <w:r>
+              <w:rPr>
+                <w:rFonts w:ascii="Consolas" w:hAnsi="Consolas" w:eastAsia="Consolas"/>
+                <w:sz w:val="18"/>
+              </w:rPr>
+              <w:t>api/TraCuuCCT/TraCuuTienMCCT</w:t>
+            </w:r>
+          </w:p>
+        </w:tc>
+      </w:tr>
+    </w:tbl>
+    <w:p/>
+    <w:p>
+      <w:pPr>
+        <w:spacing w:after="120"/>
+        <w:jc w:val="both"/>
+      </w:pPr>
+      <w:r>
+        <w:t xml:space="preserve">Đây là hằng số </w:t>
+      </w:r>
+      <w:r>
+        <w:rPr>
+          <w:rFonts w:ascii="Consolas" w:hAnsi="Consolas" w:eastAsia="Consolas"/>
+          <w:color w:val="A31D1D"/>
+          <w:sz w:val="19"/>
+        </w:rPr>
+        <w:t>API_MCCT</w:t>
+      </w:r>
+      <w:r>
+        <w:t xml:space="preserve"> trong lớp gọi API. Đường dẫn do cổng BHXH quy định, không thay đổi theo từng bệnh viện, nên không cần khai báo cấu hình — bớt một khoản phải thiết lập khi triển khai và loại luôn khả năng gõ sai.</w:t>
+      </w:r>
+    </w:p>
     <w:p>
       <w:pPr>
         <w:ind w:left="340"/>
@@ -10150,7 +10204,7 @@
               <w:rPr>
                 <w:sz w:val="20"/>
               </w:rPr>
-              <w:t xml:space="preserve"> lớp gọi API — bổ sung hàm tra cứu MCCT dùng HTTP header và body JSON</w:t>
+              <w:t xml:space="preserve"> lớp gọi API — bổ sung hàm tra cứu MCCT dùng HTTP header và body JSON, đường dẫn cố định bằng hằng số</w:t>
             </w:r>
           </w:p>
         </w:tc>
@@ -10227,7 +10281,7 @@
               <w:rPr>
                 <w:sz w:val="20"/>
               </w:rPr>
-              <w:t xml:space="preserve"> — thêm 2 tham số cấu hình mới (xem 3.1)</w:t>
+              <w:t xml:space="preserve"> — thêm cờ bật/tắt tra cứu tự động (xem 3.1)</w:t>
             </w:r>
           </w:p>
         </w:tc>

</xml_diff>

<commit_message>
Bo key AUTO_CHECK_MCCT va log toan bo ket qua tra cuu
1. Bo key HIS.CHECK_HEIN_CARD.BHXH__AUTO_CHECK_MCCT
   Tra cuu tien cung chi tra nay LUON CHAY sau khi kiem tra the thanh
   cong, khong con cau hinh bat/tat.
   - BHXHLoginCFG: bo AUTO_CHECK_MCCT, AUTO_CHECK_MCCT__ON va
     IsAutoCheckMcct.
   - Bo nhanh if o hai noi goi (CallPatientTypeAlter, RegisterV2).
   Tinh nang nay khong con tham so cau hinh rieng nao: ca duong dan API
   lan viec tu dong deu co dinh trong code.

2. Log toan bo ket qua tra cuu
   HeinGOVManager.CheckTienMCCT truoc chi log MaKetQua va GhiChu, nay
   log toan bo ResultMCCTADO gom tung ban ghi DataCCT va ThongTinSoThe.

Cap nhat tai lieu thiet ke va hai tai lieu module.

Co-Authored-By: Claude Opus 5 (1M context) <noreply@anthropic.com>
</commit_message>
<xml_diff>
--- a/docs/B_KyThuat_TraCuuTienMCCT_CungChiTraLuyKe.docx
+++ b/docs/B_KyThuat_TraCuuTienMCCT_CungChiTraLuyKe.docx
@@ -9855,34 +9855,229 @@
         <w:rPr>
           <w:rFonts w:ascii="Times New Roman" w:hAnsi="Times New Roman" w:eastAsia="Times New Roman"/>
         </w:rPr>
-        <w:t>Config mới duy nhất</w:t>
+        <w:t>Không thêm cấu hình nào</w:t>
+      </w:r>
+    </w:p>
+    <w:p>
+      <w:pPr>
+        <w:spacing w:after="120"/>
+        <w:jc w:val="both"/>
+      </w:pPr>
+      <w:r>
+        <w:t xml:space="preserve">Tính năng </w:t>
+      </w:r>
+      <w:r>
+        <w:rPr>
+          <w:b/>
+        </w:rPr>
+        <w:t>không có tham số cấu hình riêng</w:t>
+      </w:r>
+      <w:r>
+        <w:t>. Hai thứ đều cố định trong code:</w:t>
       </w:r>
     </w:p>
     <w:tbl>
       <w:tblPr>
+        <w:tblStyle w:val="TableGrid"/>
         <w:tblW w:type="auto" w:w="0"/>
-        <w:jc w:val="left"/>
+        <w:jc w:val="center"/>
         <w:tblLook w:firstColumn="1" w:firstRow="1" w:lastColumn="0" w:lastRow="0" w:noHBand="0" w:noVBand="1" w:val="04A0"/>
       </w:tblPr>
       <w:tblGrid>
-        <w:gridCol w:w="9973"/>
+        <w:gridCol w:w="3324"/>
+        <w:gridCol w:w="3324"/>
+        <w:gridCol w:w="3324"/>
       </w:tblGrid>
       <w:tr>
         <w:tc>
           <w:tcPr>
-            <w:tcW w:type="dxa" w:w="9973"/>
-            <w:shd w:val="clear" w:fill="F4F5F7"/>
-          </w:tcPr>
-          <w:p>
-            <w:pPr>
-              <w:spacing w:before="0" w:after="0" w:line="240" w:lineRule="auto"/>
+            <w:tcW w:type="dxa" w:w="3324"/>
+            <w:shd w:val="clear" w:fill="1F3A5F"/>
+          </w:tcPr>
+          <w:p>
+            <w:pPr>
+              <w:spacing w:before="40" w:after="40"/>
+            </w:pPr>
+            <w:r>
+              <w:rPr>
+                <w:rFonts w:ascii="Times New Roman" w:hAnsi="Times New Roman"/>
+                <w:b/>
+                <w:color w:val="FFFFFF"/>
+                <w:sz w:val="20"/>
+              </w:rPr>
+              <w:t>Cố định</w:t>
+            </w:r>
+          </w:p>
+        </w:tc>
+        <w:tc>
+          <w:tcPr>
+            <w:tcW w:type="dxa" w:w="3324"/>
+            <w:shd w:val="clear" w:fill="1F3A5F"/>
+          </w:tcPr>
+          <w:p>
+            <w:pPr>
+              <w:spacing w:before="40" w:after="40"/>
+            </w:pPr>
+            <w:r>
+              <w:rPr>
+                <w:rFonts w:ascii="Times New Roman" w:hAnsi="Times New Roman"/>
+                <w:b/>
+                <w:color w:val="FFFFFF"/>
+                <w:sz w:val="20"/>
+              </w:rPr>
+              <w:t>Giá trị</w:t>
+            </w:r>
+          </w:p>
+        </w:tc>
+        <w:tc>
+          <w:tcPr>
+            <w:tcW w:type="dxa" w:w="3324"/>
+            <w:shd w:val="clear" w:fill="1F3A5F"/>
+          </w:tcPr>
+          <w:p>
+            <w:pPr>
+              <w:spacing w:before="40" w:after="40"/>
+            </w:pPr>
+            <w:r>
+              <w:rPr>
+                <w:rFonts w:ascii="Times New Roman" w:hAnsi="Times New Roman"/>
+                <w:b/>
+                <w:color w:val="FFFFFF"/>
+                <w:sz w:val="20"/>
+              </w:rPr>
+              <w:t>Vì sao</w:t>
+            </w:r>
+          </w:p>
+        </w:tc>
+      </w:tr>
+      <w:tr>
+        <w:tc>
+          <w:tcPr>
+            <w:tcW w:type="dxa" w:w="3324"/>
+          </w:tcPr>
+          <w:p>
+            <w:pPr>
+              <w:spacing w:before="40" w:after="40"/>
+            </w:pPr>
+            <w:r>
+              <w:rPr>
+                <w:sz w:val="20"/>
+              </w:rPr>
+              <w:t>Đường dẫn API</w:t>
+            </w:r>
+          </w:p>
+        </w:tc>
+        <w:tc>
+          <w:tcPr>
+            <w:tcW w:type="dxa" w:w="3324"/>
+          </w:tcPr>
+          <w:p>
+            <w:pPr>
+              <w:spacing w:before="40" w:after="40"/>
             </w:pPr>
             <w:r>
               <w:rPr>
                 <w:rFonts w:ascii="Consolas" w:hAnsi="Consolas" w:eastAsia="Consolas"/>
-                <w:sz w:val="18"/>
-              </w:rPr>
-              <w:t>HIS.CHECK_HEIN_CARD.BHXH__AUTO_CHECK_MCCT    (0 = tắt tự động, 1 = bật)</w:t>
+                <w:color w:val="A31D1D"/>
+                <w:sz w:val="19"/>
+              </w:rPr>
+              <w:t>api/TraCuuCCT/TraCuuTienMCCT</w:t>
+            </w:r>
+            <w:r>
+              <w:rPr>
+                <w:sz w:val="20"/>
+              </w:rPr>
+              <w:t xml:space="preserve"> (hằng </w:t>
+            </w:r>
+            <w:r>
+              <w:rPr>
+                <w:rFonts w:ascii="Consolas" w:hAnsi="Consolas" w:eastAsia="Consolas"/>
+                <w:color w:val="A31D1D"/>
+                <w:sz w:val="19"/>
+              </w:rPr>
+              <w:t>API_MCCT</w:t>
+            </w:r>
+            <w:r>
+              <w:rPr>
+                <w:sz w:val="20"/>
+              </w:rPr>
+              <w:t>)</w:t>
+            </w:r>
+          </w:p>
+        </w:tc>
+        <w:tc>
+          <w:tcPr>
+            <w:tcW w:type="dxa" w:w="3324"/>
+          </w:tcPr>
+          <w:p>
+            <w:pPr>
+              <w:spacing w:before="40" w:after="40"/>
+            </w:pPr>
+            <w:r>
+              <w:rPr>
+                <w:sz w:val="20"/>
+              </w:rPr>
+              <w:t>Cổng BHXH quy định, không đổi theo bệnh viện</w:t>
+            </w:r>
+          </w:p>
+        </w:tc>
+      </w:tr>
+      <w:tr>
+        <w:tc>
+          <w:tcPr>
+            <w:tcW w:type="dxa" w:w="3324"/>
+            <w:shd w:val="clear" w:fill="F7F8FA"/>
+          </w:tcPr>
+          <w:p>
+            <w:pPr>
+              <w:spacing w:before="40" w:after="40"/>
+            </w:pPr>
+            <w:r>
+              <w:rPr>
+                <w:sz w:val="20"/>
+              </w:rPr>
+              <w:t>Tra cứu tự động</w:t>
+            </w:r>
+          </w:p>
+        </w:tc>
+        <w:tc>
+          <w:tcPr>
+            <w:tcW w:type="dxa" w:w="3324"/>
+            <w:shd w:val="clear" w:fill="F7F8FA"/>
+          </w:tcPr>
+          <w:p>
+            <w:pPr>
+              <w:spacing w:before="40" w:after="40"/>
+            </w:pPr>
+            <w:r>
+              <w:rPr>
+                <w:b/>
+                <w:sz w:val="20"/>
+              </w:rPr>
+              <w:t>Luôn chạy</w:t>
+            </w:r>
+            <w:r>
+              <w:rPr>
+                <w:sz w:val="20"/>
+              </w:rPr>
+              <w:t xml:space="preserve"> sau khi kiểm tra thẻ thành công</w:t>
+            </w:r>
+          </w:p>
+        </w:tc>
+        <w:tc>
+          <w:tcPr>
+            <w:tcW w:type="dxa" w:w="3324"/>
+            <w:shd w:val="clear" w:fill="F7F8FA"/>
+          </w:tcPr>
+          <w:p>
+            <w:pPr>
+              <w:spacing w:before="40" w:after="40"/>
+            </w:pPr>
+            <w:r>
+              <w:rPr>
+                <w:sz w:val="20"/>
+              </w:rPr>
+              <w:t>Là hành vi mặc định mong muốn ở mọi bệnh viện</w:t>
             </w:r>
           </w:p>
         </w:tc>
@@ -9895,64 +10090,7 @@
         <w:jc w:val="both"/>
       </w:pPr>
       <w:r>
-        <w:rPr>
-          <w:b/>
-        </w:rPr>
-        <w:t>Đường dẫn API cố định trong code</w:t>
-      </w:r>
-      <w:r>
-        <w:t>, không đưa ra cấu hình:</w:t>
-      </w:r>
-    </w:p>
-    <w:tbl>
-      <w:tblPr>
-        <w:tblW w:type="auto" w:w="0"/>
-        <w:jc w:val="left"/>
-        <w:tblLook w:firstColumn="1" w:firstRow="1" w:lastColumn="0" w:lastRow="0" w:noHBand="0" w:noVBand="1" w:val="04A0"/>
-      </w:tblPr>
-      <w:tblGrid>
-        <w:gridCol w:w="9973"/>
-      </w:tblGrid>
-      <w:tr>
-        <w:tc>
-          <w:tcPr>
-            <w:tcW w:type="dxa" w:w="9973"/>
-            <w:shd w:val="clear" w:fill="F4F5F7"/>
-          </w:tcPr>
-          <w:p>
-            <w:pPr>
-              <w:spacing w:before="0" w:after="0" w:line="240" w:lineRule="auto"/>
-            </w:pPr>
-            <w:r>
-              <w:rPr>
-                <w:rFonts w:ascii="Consolas" w:hAnsi="Consolas" w:eastAsia="Consolas"/>
-                <w:sz w:val="18"/>
-              </w:rPr>
-              <w:t>api/TraCuuCCT/TraCuuTienMCCT</w:t>
-            </w:r>
-          </w:p>
-        </w:tc>
-      </w:tr>
-    </w:tbl>
-    <w:p/>
-    <w:p>
-      <w:pPr>
-        <w:spacing w:after="120"/>
-        <w:jc w:val="both"/>
-      </w:pPr>
-      <w:r>
-        <w:t xml:space="preserve">Đây là hằng số </w:t>
-      </w:r>
-      <w:r>
-        <w:rPr>
-          <w:rFonts w:ascii="Consolas" w:hAnsi="Consolas" w:eastAsia="Consolas"/>
-          <w:color w:val="A31D1D"/>
-          <w:sz w:val="19"/>
-        </w:rPr>
-        <w:t>API_MCCT</w:t>
-      </w:r>
-      <w:r>
-        <w:t xml:space="preserve"> trong lớp gọi API. Đường dẫn do cổng BHXH quy định, không thay đổi theo từng bệnh viện, nên không cần khai báo cấu hình — bớt một khoản phải thiết lập khi triển khai và loại luôn khả năng gõ sai.</w:t>
+        <w:t>Triển khai chỉ cần tài khoản và địa chỉ cổng vốn đã có sẵn — không phải khai báo thêm gì, cũng không có khả năng gõ sai key.</w:t>
       </w:r>
     </w:p>
     <w:p>
@@ -11231,18 +11369,6 @@
                 <w:rFonts w:ascii="Consolas" w:hAnsi="Consolas" w:eastAsia="Consolas"/>
                 <w:sz w:val="18"/>
               </w:rPr>
-              <w:t xml:space="preserve">             └─ nếu AUTO_CHECK_MCCT = 1</w:t>
-            </w:r>
-          </w:p>
-          <w:p>
-            <w:pPr>
-              <w:spacing w:before="0" w:after="0" w:line="240" w:lineRule="auto"/>
-            </w:pPr>
-            <w:r>
-              <w:rPr>
-                <w:rFonts w:ascii="Consolas" w:hAnsi="Consolas" w:eastAsia="Consolas"/>
-                <w:sz w:val="18"/>
-              </w:rPr>
               <w:t xml:space="preserve">                  │</w:t>
             </w:r>
           </w:p>
@@ -13147,20 +13273,6 @@
                 <w:sz w:val="19"/>
               </w:rPr>
               <w:t>heinGOVManager.Check()</w:t>
-            </w:r>
-            <w:r>
-              <w:rPr>
-                <w:sz w:val="20"/>
-              </w:rPr>
-              <w:t xml:space="preserve">, chạy khi </w:t>
-            </w:r>
-            <w:r>
-              <w:rPr>
-                <w:rFonts w:ascii="Consolas" w:hAnsi="Consolas" w:eastAsia="Consolas"/>
-                <w:color w:val="A31D1D"/>
-                <w:sz w:val="19"/>
-              </w:rPr>
-              <w:t>BHXHLoginCFG.IsAutoCheckMcct</w:t>
             </w:r>
           </w:p>
         </w:tc>

</xml_diff>